<commit_message>
working on week 3
</commit_message>
<xml_diff>
--- a/03-inference-for-one-mean/reading guide/week3-reading-guide.docx
+++ b/03-inference-for-one-mean/reading guide/week3-reading-guide.docx
@@ -1223,7 +1223,7 @@
         <w:pStyle w:val="Compact"/>
       </w:pPr>
       <w:r>
-        <w:t xml:space="preserve">What is the unit of study?</w:t>
+        <w:t xml:space="preserve">What is the observational unit? What is the variable of interest?</w:t>
       </w:r>
     </w:p>
     <w:p>
@@ -1237,6 +1237,16 @@
       <w:r>
         <w:t xml:space="preserve">What was the sample mean?</w:t>
       </w:r>
+      <w:r>
+        <w:t xml:space="preserve"> </w:t>
+      </w:r>
+      <w:r>
+        <w:rPr>
+          <w:iCs/>
+          <w:i/>
+        </w:rPr>
+        <w:t xml:space="preserve">Use a symbol to denote this!</w:t>
+      </w:r>
     </w:p>
     <w:p>
       <w:pPr>
@@ -1249,6 +1259,16 @@
       <w:r>
         <w:t xml:space="preserve">What sample size of cars was collected?</w:t>
       </w:r>
+      <w:r>
+        <w:t xml:space="preserve"> </w:t>
+      </w:r>
+      <w:r>
+        <w:rPr>
+          <w:iCs/>
+          <w:i/>
+        </w:rPr>
+        <w:t xml:space="preserve">Use a symbol to denote this!</w:t>
+      </w:r>
     </w:p>
     <w:p>
       <w:pPr>
@@ -1261,6 +1281,16 @@
       <w:r>
         <w:t xml:space="preserve">What was the standard deviation of the sample?</w:t>
       </w:r>
+      <w:r>
+        <w:t xml:space="preserve"> </w:t>
+      </w:r>
+      <w:r>
+        <w:rPr>
+          <w:iCs/>
+          <w:i/>
+        </w:rPr>
+        <w:t xml:space="preserve">Use a symbol to denote this!</w:t>
+      </w:r>
     </w:p>
     <w:bookmarkStart w:id="30" w:name="section"/>
     <w:p>
@@ -1275,8 +1305,21 @@
       <w:pPr>
         <w:pStyle w:val="FirstParagraph"/>
       </w:pPr>
-      <w:r>
-        <w:t xml:space="preserve">How is a bootstrap sample similar to collecting a new sample from the</w:t>
+    </w:p>
+    <w:p>
+      <w:pPr>
+        <w:pStyle w:val="BodyText"/>
+      </w:pPr>
+      <w:r>
+        <w:t xml:space="preserve">How is a bootstrap sample similar to collecting a new sample from the population?</w:t>
+      </w:r>
+    </w:p>
+    <w:p>
+      <w:pPr>
+        <w:pStyle w:val="BodyText"/>
+      </w:pPr>
+      <w:r>
+        <w:t xml:space="preserve">How is a bootstrap sample different from collecting a new sample from the</w:t>
       </w:r>
       <w:r>
         <w:t xml:space="preserve"> </w:t>
@@ -1290,20 +1333,6 @@
         <w:pStyle w:val="BodyText"/>
       </w:pPr>
       <w:r>
-        <w:t xml:space="preserve">How is a bootstrap sample different from collecting a new sample from the</w:t>
-      </w:r>
-      <w:r>
-        <w:t xml:space="preserve"> </w:t>
-      </w:r>
-      <w:r>
-        <w:t xml:space="preserve">population?</w:t>
-      </w:r>
-    </w:p>
-    <w:p>
-      <w:pPr>
-        <w:pStyle w:val="BodyText"/>
-      </w:pPr>
-      <w:r>
         <w:t xml:space="preserve">To create a bootstrap distribution, for the Awesome Autos, how many cards will</w:t>
       </w:r>
       <w:r>
@@ -1358,7 +1387,7 @@
         <w:pStyle w:val="BodyText"/>
       </w:pPr>
       <w:r>
-        <w:t xml:space="preserve">__What percentiles would you have used if you wanted a 90% confidence interval?</w:t>
+        <w:t xml:space="preserve">What percentiles would you have used if you wanted a 90% confidence interval?</w:t>
       </w:r>
     </w:p>
     <w:bookmarkEnd w:id="30"/>
@@ -1458,7 +1487,7 @@
         <w:pStyle w:val="BodyText"/>
       </w:pPr>
       <w:r>
-        <w:t xml:space="preserve">Where the percentile and SE confidence intervals similar?</w:t>
+        <w:t xml:space="preserve">Were the percentile and SE confidence intervals similar?</w:t>
       </w:r>
     </w:p>
     <w:p>
@@ -1520,7 +1549,7 @@
           <w:bCs/>
           <w:b/>
         </w:rPr>
-        <w:t xml:space="preserve">Conditions to use the CLT for means:</w:t>
+        <w:t xml:space="preserve">Conditions to use the CLT (Central Limit Theorem) for means:</w:t>
       </w:r>
     </w:p>
     <w:p>
@@ -1544,31 +1573,7 @@
         <w:pStyle w:val="Compact"/>
       </w:pPr>
       <w:r>
-        <w:t xml:space="preserve">Checked by:</w:t>
-      </w:r>
-    </w:p>
-    <w:p>
-      <w:pPr>
-        <w:numPr>
-          <w:ilvl w:val="0"/>
-          <w:numId w:val="1010"/>
-        </w:numPr>
-        <w:pStyle w:val="Compact"/>
-      </w:pPr>
-      <w:r>
         <w:t xml:space="preserve">Normality:</w:t>
-      </w:r>
-    </w:p>
-    <w:p>
-      <w:pPr>
-        <w:numPr>
-          <w:ilvl w:val="0"/>
-          <w:numId w:val="1011"/>
-        </w:numPr>
-        <w:pStyle w:val="Compact"/>
-      </w:pPr>
-      <w:r>
-        <w:t xml:space="preserve">Checked by:</w:t>
       </w:r>
     </w:p>
     <w:p>
@@ -1668,7 +1673,7 @@
         <w:pStyle w:val="Heading4"/>
       </w:pPr>
       <w:r>
-        <w:t xml:space="preserve">Formulas</w:t>
+        <w:t xml:space="preserve">19.2.4 Formulas:</w:t>
       </w:r>
     </w:p>
     <w:p>
@@ -1715,12 +1720,20 @@
         <w:pStyle w:val="BodyText"/>
       </w:pPr>
       <m:oMath>
-        <m:sSup>
+        <m:sSubSup>
           <m:e>
             <m:r>
               <m:t>t</m:t>
             </m:r>
           </m:e>
+          <m:sub>
+            <m:r>
+              <m:t>d</m:t>
+            </m:r>
+            <m:r>
+              <m:t>f</m:t>
+            </m:r>
+          </m:sub>
           <m:sup>
             <m:r>
               <m:rPr>
@@ -1729,7 +1742,7 @@
               <m:t>*</m:t>
             </m:r>
           </m:sup>
-        </m:sSup>
+        </m:sSubSup>
       </m:oMath>
       <w:r>
         <w:t xml:space="preserve">:</w:t>
@@ -2125,12 +2138,6 @@
     <w:abstractNumId w:val="991"/>
   </w:num>
   <w:num w:numId="1009">
-    <w:abstractNumId w:val="991"/>
-  </w:num>
-  <w:num w:numId="1010">
-    <w:abstractNumId w:val="991"/>
-  </w:num>
-  <w:num w:numId="1011">
     <w:abstractNumId w:val="991"/>
   </w:num>
 </w:numbering>

</xml_diff>